<commit_message>
update lecture 7 LSTM
</commit_message>
<xml_diff>
--- a/Lecture7.docx
+++ b/Lecture7.docx
@@ -44,8 +44,6 @@
           <w:szCs w:val="24"/>
         </w:rPr>
       </w:pPr>
-      <w:bookmarkStart w:id="0" w:name="_GoBack"/>
-      <w:bookmarkEnd w:id="0"/>
       <w:r>
         <w:rPr>
           <w:rFonts w:hint="default" w:ascii="Times New Roman" w:hAnsi="Times New Roman" w:cs="Times New Roman"/>
@@ -1376,6 +1374,7 @@
     <w:p>
       <w:pPr>
         <w:numPr>
+          <w:ilvl w:val="0"/>
           <w:numId w:val="0"/>
         </w:numPr>
         <w:ind w:leftChars="0"/>
@@ -1404,6 +1403,7 @@
     <w:p>
       <w:pPr>
         <w:numPr>
+          <w:ilvl w:val="0"/>
           <w:numId w:val="0"/>
         </w:numPr>
         <w:ind w:leftChars="0" w:firstLine="420" w:firstLineChars="0"/>
@@ -1447,6 +1447,7 @@
     <w:p>
       <w:pPr>
         <w:numPr>
+          <w:ilvl w:val="0"/>
           <w:numId w:val="0"/>
         </w:numPr>
         <w:ind w:leftChars="0" w:firstLine="420" w:firstLineChars="0"/>
@@ -1478,6 +1479,7 @@
     <w:p>
       <w:pPr>
         <w:numPr>
+          <w:ilvl w:val="0"/>
           <w:numId w:val="0"/>
         </w:numPr>
         <w:ind w:leftChars="0" w:firstLine="420" w:firstLineChars="0"/>
@@ -1521,6 +1523,7 @@
     <w:p>
       <w:pPr>
         <w:numPr>
+          <w:ilvl w:val="0"/>
           <w:numId w:val="0"/>
         </w:numPr>
         <w:ind w:leftChars="0" w:firstLine="420" w:firstLineChars="0"/>
@@ -1553,6 +1556,7 @@
     <w:p>
       <w:pPr>
         <w:numPr>
+          <w:ilvl w:val="0"/>
           <w:numId w:val="0"/>
         </w:numPr>
         <w:jc w:val="left"/>
@@ -1576,6 +1580,7 @@
     <w:p>
       <w:pPr>
         <w:numPr>
+          <w:ilvl w:val="0"/>
           <w:numId w:val="0"/>
         </w:numPr>
         <w:ind w:firstLine="420" w:firstLineChars="0"/>
@@ -1607,6 +1612,7 @@
     <w:p>
       <w:pPr>
         <w:numPr>
+          <w:ilvl w:val="0"/>
           <w:numId w:val="0"/>
         </w:numPr>
         <w:ind w:firstLine="420" w:firstLineChars="0"/>
@@ -1677,6 +1683,7 @@
     <w:p>
       <w:pPr>
         <w:numPr>
+          <w:ilvl w:val="0"/>
           <w:numId w:val="0"/>
         </w:numPr>
         <w:ind w:leftChars="0"/>
@@ -1701,6 +1708,7 @@
     <w:p>
       <w:pPr>
         <w:numPr>
+          <w:ilvl w:val="0"/>
           <w:numId w:val="0"/>
         </w:numPr>
         <w:ind w:leftChars="0"/>
@@ -1811,21 +1819,23 @@
     <w:p>
       <w:pPr>
         <w:numPr>
-          <w:numId w:val="0"/>
-        </w:numPr>
-        <w:ind w:leftChars="0"/>
-        <w:jc w:val="left"/>
-        <w:rPr>
-          <w:rFonts w:hint="default" w:ascii="Times New Roman" w:hAnsi="Times New Roman" w:cs="Times New Roman"/>
-          <w:sz w:val="24"/>
-          <w:szCs w:val="24"/>
-          <w:lang w:val="en-US"/>
-        </w:rPr>
-      </w:pPr>
-    </w:p>
-    <w:p>
-      <w:pPr>
-        <w:numPr>
+          <w:ilvl w:val="0"/>
+          <w:numId w:val="0"/>
+        </w:numPr>
+        <w:ind w:leftChars="0"/>
+        <w:jc w:val="left"/>
+        <w:rPr>
+          <w:rFonts w:hint="default" w:ascii="Times New Roman" w:hAnsi="Times New Roman" w:cs="Times New Roman"/>
+          <w:sz w:val="24"/>
+          <w:szCs w:val="24"/>
+          <w:lang w:val="en-US"/>
+        </w:rPr>
+      </w:pPr>
+    </w:p>
+    <w:p>
+      <w:pPr>
+        <w:numPr>
+          <w:ilvl w:val="0"/>
           <w:numId w:val="0"/>
         </w:numPr>
         <w:ind w:leftChars="0"/>
@@ -1850,6 +1860,7 @@
     <w:p>
       <w:pPr>
         <w:numPr>
+          <w:ilvl w:val="0"/>
           <w:numId w:val="0"/>
         </w:numPr>
         <w:ind w:leftChars="0"/>
@@ -1874,6 +1885,7 @@
     <w:p>
       <w:pPr>
         <w:numPr>
+          <w:ilvl w:val="0"/>
           <w:numId w:val="0"/>
         </w:numPr>
         <w:ind w:leftChars="0"/>
@@ -1936,6 +1948,7 @@
     <w:p>
       <w:pPr>
         <w:numPr>
+          <w:ilvl w:val="0"/>
           <w:numId w:val="0"/>
         </w:numPr>
         <w:ind w:leftChars="0"/>
@@ -1989,6 +2002,7 @@
     <w:p>
       <w:pPr>
         <w:numPr>
+          <w:ilvl w:val="0"/>
           <w:numId w:val="0"/>
         </w:numPr>
         <w:ind w:leftChars="0"/>
@@ -2051,6 +2065,7 @@
     <w:p>
       <w:pPr>
         <w:numPr>
+          <w:ilvl w:val="0"/>
           <w:numId w:val="0"/>
         </w:numPr>
         <w:ind w:leftChars="0"/>
@@ -2071,7 +2086,8 @@
           <w:lang w:val="en-US"/>
         </w:rPr>
         <w:object>
-          <v:shape id="_x0000_i1030" o:spt="75" type="#_x0000_t75" style="height:70pt;width:227pt;" o:ole="t" filled="f" o:preferrelative="t" stroked="f" coordsize="21600,21600">
+          <v:shape id="_x0000_i1028" o:spt="75" type="#_x0000_t75" style="height:70pt;width:227pt;" o:ole="t" filled="f" o:preferrelative="t" stroked="f" coordsize="21600,21600">
+            <v:path/>
             <v:fill on="f" focussize="0,0"/>
             <v:stroke on="f"/>
             <v:imagedata r:id="rId16" o:title=""/>
@@ -2079,7 +2095,7 @@
             <w10:wrap type="none"/>
             <w10:anchorlock/>
           </v:shape>
-          <o:OLEObject Type="Embed" ProgID="Equation.KSEE3" ShapeID="_x0000_i1030" DrawAspect="Content" ObjectID="_1468075726" r:id="rId15">
+          <o:OLEObject Type="Embed" ProgID="Equation.KSEE3" ShapeID="_x0000_i1028" DrawAspect="Content" ObjectID="_1468075726" r:id="rId15">
             <o:LockedField>false</o:LockedField>
           </o:OLEObject>
         </w:object>
@@ -2088,6 +2104,7 @@
     <w:p>
       <w:pPr>
         <w:numPr>
+          <w:ilvl w:val="0"/>
           <w:numId w:val="0"/>
         </w:numPr>
         <w:ind w:leftChars="0"/>
@@ -2112,21 +2129,23 @@
     <w:p>
       <w:pPr>
         <w:numPr>
-          <w:numId w:val="0"/>
-        </w:numPr>
-        <w:ind w:leftChars="0"/>
-        <w:jc w:val="left"/>
-        <w:rPr>
-          <w:rFonts w:hint="default" w:ascii="Times New Roman" w:hAnsi="Times New Roman" w:cs="Times New Roman"/>
-          <w:sz w:val="24"/>
-          <w:szCs w:val="24"/>
-          <w:lang w:val="en-US"/>
-        </w:rPr>
-      </w:pPr>
-    </w:p>
-    <w:p>
-      <w:pPr>
-        <w:numPr>
+          <w:ilvl w:val="0"/>
+          <w:numId w:val="0"/>
+        </w:numPr>
+        <w:ind w:leftChars="0"/>
+        <w:jc w:val="left"/>
+        <w:rPr>
+          <w:rFonts w:hint="default" w:ascii="Times New Roman" w:hAnsi="Times New Roman" w:cs="Times New Roman"/>
+          <w:sz w:val="24"/>
+          <w:szCs w:val="24"/>
+          <w:lang w:val="en-US"/>
+        </w:rPr>
+      </w:pPr>
+    </w:p>
+    <w:p>
+      <w:pPr>
+        <w:numPr>
+          <w:ilvl w:val="0"/>
           <w:numId w:val="0"/>
         </w:numPr>
         <w:ind w:leftChars="0"/>
@@ -2151,6 +2170,7 @@
     <w:p>
       <w:pPr>
         <w:numPr>
+          <w:ilvl w:val="0"/>
           <w:numId w:val="0"/>
         </w:numPr>
         <w:ind w:leftChars="0"/>
@@ -2171,7 +2191,7 @@
           <w:lang w:val="en-US"/>
         </w:rPr>
         <w:object>
-          <v:shape id="_x0000_i1031" o:spt="75" alt="" type="#_x0000_t75" style="height:70pt;width:101pt;" o:ole="t" filled="f" o:preferrelative="t" stroked="f" coordsize="21600,21600">
+          <v:shape id="_x0000_i1029" o:spt="75" type="#_x0000_t75" style="height:70pt;width:101pt;" o:ole="t" filled="f" o:preferrelative="t" stroked="f" coordsize="21600,21600">
             <v:path/>
             <v:fill on="f" focussize="0,0"/>
             <v:stroke on="f"/>
@@ -2180,7 +2200,7 @@
             <w10:wrap type="none"/>
             <w10:anchorlock/>
           </v:shape>
-          <o:OLEObject Type="Embed" ProgID="Equation.KSEE3" ShapeID="_x0000_i1031" DrawAspect="Content" ObjectID="_1468075727" r:id="rId17">
+          <o:OLEObject Type="Embed" ProgID="Equation.KSEE3" ShapeID="_x0000_i1029" DrawAspect="Content" ObjectID="_1468075727" r:id="rId17">
             <o:LockedField>false</o:LockedField>
           </o:OLEObject>
         </w:object>
@@ -2189,6 +2209,7 @@
     <w:p>
       <w:pPr>
         <w:numPr>
+          <w:ilvl w:val="0"/>
           <w:numId w:val="0"/>
         </w:numPr>
         <w:ind w:leftChars="0"/>
@@ -2213,6 +2234,7 @@
     <w:p>
       <w:pPr>
         <w:numPr>
+          <w:ilvl w:val="0"/>
           <w:numId w:val="0"/>
         </w:numPr>
         <w:ind w:leftChars="0"/>
@@ -2237,6 +2259,7 @@
     <w:p>
       <w:pPr>
         <w:numPr>
+          <w:ilvl w:val="0"/>
           <w:numId w:val="0"/>
         </w:numPr>
         <w:ind w:leftChars="0"/>
@@ -2261,17 +2284,546 @@
     <w:p>
       <w:pPr>
         <w:numPr>
-          <w:numId w:val="0"/>
-        </w:numPr>
-        <w:ind w:leftChars="0"/>
-        <w:jc w:val="left"/>
-        <w:rPr>
-          <w:rFonts w:hint="default" w:ascii="Times New Roman" w:hAnsi="Times New Roman" w:cs="Times New Roman"/>
-          <w:sz w:val="24"/>
-          <w:szCs w:val="24"/>
-          <w:lang w:val="en-US"/>
-        </w:rPr>
-      </w:pPr>
+          <w:ilvl w:val="0"/>
+          <w:numId w:val="0"/>
+        </w:numPr>
+        <w:ind w:leftChars="0"/>
+        <w:jc w:val="left"/>
+        <w:rPr>
+          <w:rFonts w:hint="default" w:ascii="Times New Roman" w:hAnsi="Times New Roman" w:cs="Times New Roman"/>
+          <w:sz w:val="24"/>
+          <w:szCs w:val="24"/>
+          <w:lang w:val="en-US"/>
+        </w:rPr>
+      </w:pPr>
+    </w:p>
+    <w:p>
+      <w:pPr>
+        <w:numPr>
+          <w:ilvl w:val="0"/>
+          <w:numId w:val="1"/>
+        </w:numPr>
+        <w:ind w:left="0" w:leftChars="0" w:firstLine="0" w:firstLineChars="0"/>
+        <w:jc w:val="left"/>
+        <w:rPr>
+          <w:rFonts w:hint="default" w:ascii="Times New Roman" w:hAnsi="Times New Roman" w:eastAsia="SimSun" w:cs="Times New Roman"/>
+          <w:b/>
+          <w:bCs/>
+          <w:sz w:val="24"/>
+          <w:szCs w:val="24"/>
+          <w:lang w:val="en-US"/>
+        </w:rPr>
+      </w:pPr>
+      <w:r>
+        <w:rPr>
+          <w:rFonts w:hint="default" w:ascii="Times New Roman" w:hAnsi="Times New Roman" w:eastAsia="SimSun" w:cs="Times New Roman"/>
+          <w:b/>
+          <w:bCs/>
+          <w:sz w:val="24"/>
+          <w:szCs w:val="24"/>
+          <w:lang w:val="en-US"/>
+        </w:rPr>
+        <w:t>LSTM</w:t>
+      </w:r>
+    </w:p>
+    <w:p>
+      <w:pPr>
+        <w:numPr>
+          <w:ilvl w:val="0"/>
+          <w:numId w:val="0"/>
+        </w:numPr>
+        <w:ind w:leftChars="0"/>
+        <w:jc w:val="left"/>
+        <w:rPr>
+          <w:rFonts w:hint="default" w:ascii="Times New Roman" w:hAnsi="Times New Roman" w:eastAsia="SimSun" w:cs="Times New Roman"/>
+          <w:sz w:val="24"/>
+          <w:szCs w:val="24"/>
+          <w:lang w:val="en-US"/>
+        </w:rPr>
+      </w:pPr>
+      <w:r>
+        <w:rPr>
+          <w:rFonts w:hint="default" w:ascii="Times New Roman" w:hAnsi="Times New Roman" w:eastAsia="SimSun" w:cs="Times New Roman"/>
+          <w:sz w:val="24"/>
+          <w:szCs w:val="24"/>
+          <w:lang w:val="en-US"/>
+        </w:rPr>
+        <w:t>Vấn đề của RNN: mọi thứ bị nhét vào 1 hidden state duy nhất -&gt; chuỗi dài -&gt; bản chất là vẫn lưu thông tin của các token trước đó (nhưng khó giữ đc nhiều vì sẽ bị trộn)</w:t>
+      </w:r>
+    </w:p>
+    <w:p>
+      <w:pPr>
+        <w:numPr>
+          <w:ilvl w:val="0"/>
+          <w:numId w:val="0"/>
+        </w:numPr>
+        <w:ind w:leftChars="0"/>
+        <w:jc w:val="center"/>
+      </w:pPr>
+      <w:r>
+        <w:drawing>
+          <wp:inline distT="0" distB="0" distL="114300" distR="114300">
+            <wp:extent cx="2879725" cy="1764030"/>
+            <wp:effectExtent l="0" t="0" r="635" b="3810"/>
+            <wp:docPr id="10" name="Picture 6"/>
+            <wp:cNvGraphicFramePr>
+              <a:graphicFrameLocks xmlns:a="http://schemas.openxmlformats.org/drawingml/2006/main" noChangeAspect="1"/>
+            </wp:cNvGraphicFramePr>
+            <a:graphic xmlns:a="http://schemas.openxmlformats.org/drawingml/2006/main">
+              <a:graphicData uri="http://schemas.openxmlformats.org/drawingml/2006/picture">
+                <pic:pic xmlns:pic="http://schemas.openxmlformats.org/drawingml/2006/picture">
+                  <pic:nvPicPr>
+                    <pic:cNvPr id="10" name="Picture 6"/>
+                    <pic:cNvPicPr>
+                      <a:picLocks noChangeAspect="1"/>
+                    </pic:cNvPicPr>
+                  </pic:nvPicPr>
+                  <pic:blipFill>
+                    <a:blip r:embed="rId19"/>
+                    <a:stretch>
+                      <a:fillRect/>
+                    </a:stretch>
+                  </pic:blipFill>
+                  <pic:spPr>
+                    <a:xfrm>
+                      <a:off x="0" y="0"/>
+                      <a:ext cx="2879725" cy="1764030"/>
+                    </a:xfrm>
+                    <a:prstGeom prst="rect">
+                      <a:avLst/>
+                    </a:prstGeom>
+                    <a:noFill/>
+                    <a:ln>
+                      <a:noFill/>
+                    </a:ln>
+                  </pic:spPr>
+                </pic:pic>
+              </a:graphicData>
+            </a:graphic>
+          </wp:inline>
+        </w:drawing>
+      </w:r>
+    </w:p>
+    <w:p>
+      <w:pPr>
+        <w:numPr>
+          <w:ilvl w:val="0"/>
+          <w:numId w:val="0"/>
+        </w:numPr>
+        <w:ind w:leftChars="0"/>
+        <w:jc w:val="left"/>
+        <w:rPr>
+          <w:rFonts w:hint="default" w:ascii="Times New Roman" w:hAnsi="Times New Roman" w:cs="Times New Roman"/>
+          <w:sz w:val="24"/>
+          <w:szCs w:val="24"/>
+          <w:lang w:val="en-US"/>
+        </w:rPr>
+      </w:pPr>
+      <w:r>
+        <w:rPr>
+          <w:rFonts w:hint="default" w:ascii="Times New Roman" w:hAnsi="Times New Roman" w:cs="Times New Roman"/>
+          <w:sz w:val="24"/>
+          <w:szCs w:val="24"/>
+          <w:lang w:val="en-US"/>
+        </w:rPr>
+        <w:t xml:space="preserve">Khác với RNN chỉ nhân W với hidden state trước và xt hiện tại thì LSTM còn chia kết quả của tích này thành 4 gates: </w:t>
+      </w:r>
+    </w:p>
+    <w:p>
+      <w:pPr>
+        <w:numPr>
+          <w:ilvl w:val="0"/>
+          <w:numId w:val="0"/>
+        </w:numPr>
+        <w:ind w:leftChars="0"/>
+        <w:jc w:val="left"/>
+        <w:rPr>
+          <w:rFonts w:hint="default" w:ascii="Times New Roman" w:hAnsi="Times New Roman" w:cs="Times New Roman"/>
+          <w:sz w:val="24"/>
+          <w:szCs w:val="24"/>
+          <w:lang w:val="en-US"/>
+        </w:rPr>
+      </w:pPr>
+      <w:r>
+        <w:rPr>
+          <w:rFonts w:hint="default" w:ascii="Times New Roman" w:hAnsi="Times New Roman" w:cs="Times New Roman"/>
+          <w:sz w:val="24"/>
+          <w:szCs w:val="24"/>
+          <w:lang w:val="en-US"/>
+        </w:rPr>
+        <w:t>+ i: input gate</w:t>
+      </w:r>
+    </w:p>
+    <w:p>
+      <w:pPr>
+        <w:numPr>
+          <w:ilvl w:val="0"/>
+          <w:numId w:val="0"/>
+        </w:numPr>
+        <w:ind w:leftChars="0"/>
+        <w:jc w:val="left"/>
+        <w:rPr>
+          <w:rFonts w:hint="default" w:ascii="Times New Roman" w:hAnsi="Times New Roman" w:cs="Times New Roman"/>
+          <w:sz w:val="24"/>
+          <w:szCs w:val="24"/>
+          <w:lang w:val="en-US"/>
+        </w:rPr>
+      </w:pPr>
+      <w:r>
+        <w:rPr>
+          <w:rFonts w:hint="default" w:ascii="Times New Roman" w:hAnsi="Times New Roman" w:cs="Times New Roman"/>
+          <w:sz w:val="24"/>
+          <w:szCs w:val="24"/>
+          <w:lang w:val="en-US"/>
+        </w:rPr>
+        <w:t>+ f: forget gate</w:t>
+      </w:r>
+    </w:p>
+    <w:p>
+      <w:pPr>
+        <w:numPr>
+          <w:ilvl w:val="0"/>
+          <w:numId w:val="0"/>
+        </w:numPr>
+        <w:ind w:leftChars="0"/>
+        <w:jc w:val="left"/>
+        <w:rPr>
+          <w:rFonts w:hint="default" w:ascii="Times New Roman" w:hAnsi="Times New Roman" w:cs="Times New Roman"/>
+          <w:sz w:val="24"/>
+          <w:szCs w:val="24"/>
+          <w:lang w:val="en-US"/>
+        </w:rPr>
+      </w:pPr>
+      <w:r>
+        <w:rPr>
+          <w:rFonts w:hint="default" w:ascii="Times New Roman" w:hAnsi="Times New Roman" w:cs="Times New Roman"/>
+          <w:sz w:val="24"/>
+          <w:szCs w:val="24"/>
+          <w:lang w:val="en-US"/>
+        </w:rPr>
+        <w:t>+ o: output gate</w:t>
+      </w:r>
+    </w:p>
+    <w:p>
+      <w:pPr>
+        <w:numPr>
+          <w:ilvl w:val="0"/>
+          <w:numId w:val="0"/>
+        </w:numPr>
+        <w:ind w:leftChars="0"/>
+        <w:jc w:val="left"/>
+        <w:rPr>
+          <w:rFonts w:hint="default" w:ascii="Times New Roman" w:hAnsi="Times New Roman" w:cs="Times New Roman"/>
+          <w:sz w:val="24"/>
+          <w:szCs w:val="24"/>
+          <w:lang w:val="en-US"/>
+        </w:rPr>
+      </w:pPr>
+      <w:r>
+        <w:rPr>
+          <w:rFonts w:hint="default" w:ascii="Times New Roman" w:hAnsi="Times New Roman" w:cs="Times New Roman"/>
+          <w:sz w:val="24"/>
+          <w:szCs w:val="24"/>
+          <w:lang w:val="en-US"/>
+        </w:rPr>
+        <w:t>+ g: candidate (nội dung đề xuất ghi vào memory)</w:t>
+      </w:r>
+    </w:p>
+    <w:p>
+      <w:pPr>
+        <w:numPr>
+          <w:ilvl w:val="0"/>
+          <w:numId w:val="0"/>
+        </w:numPr>
+        <w:ind w:leftChars="0"/>
+        <w:jc w:val="left"/>
+        <w:rPr>
+          <w:rFonts w:hint="default" w:ascii="Times New Roman" w:hAnsi="Times New Roman" w:cs="Times New Roman"/>
+          <w:sz w:val="24"/>
+          <w:szCs w:val="24"/>
+          <w:lang w:val="en-US"/>
+        </w:rPr>
+      </w:pPr>
+      <w:r>
+        <w:rPr>
+          <w:rFonts w:hint="default" w:ascii="Times New Roman" w:hAnsi="Times New Roman" w:cs="Times New Roman"/>
+          <w:sz w:val="24"/>
+          <w:szCs w:val="24"/>
+          <w:lang w:val="en-US"/>
+        </w:rPr>
+        <w:t>3 cổng i,f,o sẽ có dạng sigmoid -&gt; nó sẽ quyết định bao nhiêu dữ liệu sẽ được qua</w:t>
+      </w:r>
+    </w:p>
+    <w:p>
+      <w:pPr>
+        <w:numPr>
+          <w:ilvl w:val="0"/>
+          <w:numId w:val="0"/>
+        </w:numPr>
+        <w:ind w:leftChars="0"/>
+        <w:jc w:val="left"/>
+        <w:rPr>
+          <w:rFonts w:hint="default" w:ascii="Times New Roman" w:hAnsi="Times New Roman" w:cs="Times New Roman"/>
+          <w:sz w:val="24"/>
+          <w:szCs w:val="24"/>
+          <w:lang w:val="en-US"/>
+        </w:rPr>
+      </w:pPr>
+      <w:r>
+        <w:rPr>
+          <w:rFonts w:hint="default" w:ascii="Times New Roman" w:hAnsi="Times New Roman" w:cs="Times New Roman"/>
+          <w:sz w:val="24"/>
+          <w:szCs w:val="24"/>
+          <w:lang w:val="en-US"/>
+        </w:rPr>
+        <w:t xml:space="preserve">Cổng g sẽ là tanh vì nó sẽ quyết định học thêm feature (dương) này hay giảm feature này đi (âm) </w:t>
+      </w:r>
+    </w:p>
+    <w:p>
+      <w:pPr>
+        <w:numPr>
+          <w:ilvl w:val="0"/>
+          <w:numId w:val="0"/>
+        </w:numPr>
+        <w:ind w:leftChars="0"/>
+        <w:jc w:val="left"/>
+        <w:rPr>
+          <w:rFonts w:hint="default" w:ascii="Times New Roman" w:hAnsi="Times New Roman" w:cs="Times New Roman"/>
+          <w:sz w:val="24"/>
+          <w:szCs w:val="24"/>
+          <w:lang w:val="en-US"/>
+        </w:rPr>
+      </w:pPr>
+      <w:r>
+        <w:rPr>
+          <w:rFonts w:hint="default" w:ascii="Times New Roman" w:hAnsi="Times New Roman" w:cs="Times New Roman"/>
+          <w:sz w:val="24"/>
+          <w:szCs w:val="24"/>
+          <w:lang w:val="en-US"/>
+        </w:rPr>
+        <w:t>Cell state: là cái mà LSTM đang nhớ</w:t>
+      </w:r>
+    </w:p>
+    <w:p>
+      <w:pPr>
+        <w:numPr>
+          <w:ilvl w:val="0"/>
+          <w:numId w:val="0"/>
+        </w:numPr>
+        <w:ind w:leftChars="0"/>
+        <w:jc w:val="left"/>
+        <w:rPr>
+          <w:rFonts w:hint="default" w:ascii="Times New Roman" w:hAnsi="Times New Roman" w:cs="Times New Roman"/>
+          <w:sz w:val="24"/>
+          <w:szCs w:val="24"/>
+          <w:lang w:val="en-US"/>
+        </w:rPr>
+      </w:pPr>
+      <w:r>
+        <w:rPr>
+          <w:rFonts w:hint="default" w:ascii="Times New Roman" w:hAnsi="Times New Roman" w:cs="Times New Roman"/>
+          <w:sz w:val="24"/>
+          <w:szCs w:val="24"/>
+          <w:lang w:val="en-US"/>
+        </w:rPr>
+        <w:t>+ f . ct-1: nghĩa là nó sẽ được quên bao nhiêu từ cell trước</w:t>
+      </w:r>
+    </w:p>
+    <w:p>
+      <w:pPr>
+        <w:numPr>
+          <w:ilvl w:val="0"/>
+          <w:numId w:val="0"/>
+        </w:numPr>
+        <w:ind w:leftChars="0"/>
+        <w:jc w:val="left"/>
+        <w:rPr>
+          <w:rFonts w:hint="default" w:ascii="Times New Roman" w:hAnsi="Times New Roman" w:cs="Times New Roman"/>
+          <w:sz w:val="24"/>
+          <w:szCs w:val="24"/>
+          <w:lang w:val="en-US"/>
+        </w:rPr>
+      </w:pPr>
+      <w:r>
+        <w:rPr>
+          <w:rFonts w:hint="default" w:ascii="Times New Roman" w:hAnsi="Times New Roman" w:cs="Times New Roman"/>
+          <w:sz w:val="24"/>
+          <w:szCs w:val="24"/>
+          <w:lang w:val="en-US"/>
+        </w:rPr>
+        <w:t>+ i . g: được gắn thêm vào memory bao nhiêu từ nội dung g</w:t>
+      </w:r>
+    </w:p>
+    <w:p>
+      <w:pPr>
+        <w:numPr>
+          <w:ilvl w:val="0"/>
+          <w:numId w:val="0"/>
+        </w:numPr>
+        <w:ind w:leftChars="0"/>
+        <w:jc w:val="left"/>
+        <w:rPr>
+          <w:rFonts w:hint="default" w:ascii="Times New Roman" w:hAnsi="Times New Roman" w:cs="Times New Roman"/>
+          <w:sz w:val="24"/>
+          <w:szCs w:val="24"/>
+          <w:lang w:val="en-US"/>
+        </w:rPr>
+      </w:pPr>
+      <w:r>
+        <w:rPr>
+          <w:rFonts w:hint="default" w:ascii="Times New Roman" w:hAnsi="Times New Roman" w:cs="Times New Roman"/>
+          <w:sz w:val="24"/>
+          <w:szCs w:val="24"/>
+          <w:lang w:val="en-US"/>
+        </w:rPr>
+        <w:t>Hidden state sẽ là từ cổng output và tanh(ct) -&gt; output cuối sẽ được xây dựng từ bao nhiêu cell state hiện tại (t)</w:t>
+      </w:r>
+    </w:p>
+    <w:p>
+      <w:pPr>
+        <w:numPr>
+          <w:ilvl w:val="0"/>
+          <w:numId w:val="0"/>
+        </w:numPr>
+        <w:ind w:leftChars="0"/>
+        <w:jc w:val="left"/>
+      </w:pPr>
+      <w:r>
+        <w:drawing>
+          <wp:inline distT="0" distB="0" distL="114300" distR="114300">
+            <wp:extent cx="5266055" cy="1559560"/>
+            <wp:effectExtent l="0" t="0" r="6985" b="10160"/>
+            <wp:docPr id="11" name="Picture 7"/>
+            <wp:cNvGraphicFramePr>
+              <a:graphicFrameLocks xmlns:a="http://schemas.openxmlformats.org/drawingml/2006/main" noChangeAspect="1"/>
+            </wp:cNvGraphicFramePr>
+            <a:graphic xmlns:a="http://schemas.openxmlformats.org/drawingml/2006/main">
+              <a:graphicData uri="http://schemas.openxmlformats.org/drawingml/2006/picture">
+                <pic:pic xmlns:pic="http://schemas.openxmlformats.org/drawingml/2006/picture">
+                  <pic:nvPicPr>
+                    <pic:cNvPr id="11" name="Picture 7"/>
+                    <pic:cNvPicPr>
+                      <a:picLocks noChangeAspect="1"/>
+                    </pic:cNvPicPr>
+                  </pic:nvPicPr>
+                  <pic:blipFill>
+                    <a:blip r:embed="rId20"/>
+                    <a:stretch>
+                      <a:fillRect/>
+                    </a:stretch>
+                  </pic:blipFill>
+                  <pic:spPr>
+                    <a:xfrm>
+                      <a:off x="0" y="0"/>
+                      <a:ext cx="5266055" cy="1559560"/>
+                    </a:xfrm>
+                    <a:prstGeom prst="rect">
+                      <a:avLst/>
+                    </a:prstGeom>
+                    <a:noFill/>
+                    <a:ln>
+                      <a:noFill/>
+                    </a:ln>
+                  </pic:spPr>
+                </pic:pic>
+              </a:graphicData>
+            </a:graphic>
+          </wp:inline>
+        </w:drawing>
+      </w:r>
+    </w:p>
+    <w:p>
+      <w:pPr>
+        <w:numPr>
+          <w:ilvl w:val="0"/>
+          <w:numId w:val="0"/>
+        </w:numPr>
+        <w:ind w:leftChars="0"/>
+        <w:jc w:val="left"/>
+        <w:rPr>
+          <w:rFonts w:hint="default" w:ascii="Times New Roman" w:hAnsi="Times New Roman" w:cs="Times New Roman"/>
+          <w:sz w:val="24"/>
+          <w:szCs w:val="24"/>
+          <w:lang w:val="en-US"/>
+        </w:rPr>
+      </w:pPr>
+      <w:r>
+        <w:rPr>
+          <w:rFonts w:hint="default" w:ascii="Times New Roman" w:hAnsi="Times New Roman" w:cs="Times New Roman"/>
+          <w:sz w:val="24"/>
+          <w:szCs w:val="24"/>
+          <w:lang w:val="en-US"/>
+        </w:rPr>
+        <w:t xml:space="preserve">Backprogation sẽ chỉ phụ thuộc vào f </w:t>
+      </w:r>
+    </w:p>
+    <w:p>
+      <w:pPr>
+        <w:numPr>
+          <w:ilvl w:val="0"/>
+          <w:numId w:val="0"/>
+        </w:numPr>
+        <w:ind w:leftChars="0"/>
+        <w:jc w:val="left"/>
+        <w:rPr>
+          <w:rFonts w:hint="default" w:ascii="Times New Roman" w:hAnsi="Times New Roman" w:cs="Times New Roman"/>
+          <w:sz w:val="24"/>
+          <w:szCs w:val="24"/>
+          <w:lang w:val="en-US"/>
+        </w:rPr>
+      </w:pPr>
+      <w:r>
+        <w:rPr>
+          <w:rFonts w:hint="default" w:ascii="Times New Roman" w:hAnsi="Times New Roman" w:cs="Times New Roman"/>
+          <w:sz w:val="24"/>
+          <w:szCs w:val="24"/>
+          <w:lang w:val="en-US"/>
+        </w:rPr>
+        <w:t>Nhìn kĩ cái này chưa phải là cập nhật từ loss giữa output và grouthtruth mà đang là loss giữa các Cell state</w:t>
+      </w:r>
+    </w:p>
+    <w:p>
+      <w:pPr>
+        <w:numPr>
+          <w:ilvl w:val="0"/>
+          <w:numId w:val="0"/>
+        </w:numPr>
+        <w:ind w:leftChars="0"/>
+        <w:jc w:val="left"/>
+        <w:rPr>
+          <w:rFonts w:hint="default" w:ascii="Times New Roman" w:hAnsi="Times New Roman" w:cs="Times New Roman"/>
+          <w:sz w:val="24"/>
+          <w:szCs w:val="24"/>
+          <w:lang w:val="en-US"/>
+        </w:rPr>
+      </w:pPr>
+      <w:r>
+        <w:rPr>
+          <w:rFonts w:hint="default" w:ascii="Times New Roman" w:hAnsi="Times New Roman" w:cs="Times New Roman"/>
+          <w:sz w:val="24"/>
+          <w:szCs w:val="24"/>
+          <w:lang w:val="en-US"/>
+        </w:rPr>
+        <w:t>-&gt; Tùy vào bài tùy vào loại output many to one hay many to many sẽ có các cách cập nhật khác nhau cho mỗi thành phần của W</w:t>
+      </w:r>
+    </w:p>
+    <w:p>
+      <w:pPr>
+        <w:numPr>
+          <w:ilvl w:val="0"/>
+          <w:numId w:val="0"/>
+        </w:numPr>
+        <w:ind w:leftChars="0"/>
+        <w:jc w:val="left"/>
+        <w:rPr>
+          <w:rFonts w:hint="default" w:ascii="Times New Roman" w:hAnsi="Times New Roman" w:cs="Times New Roman"/>
+          <w:sz w:val="24"/>
+          <w:szCs w:val="24"/>
+          <w:lang w:val="en-US"/>
+        </w:rPr>
+      </w:pPr>
+      <w:bookmarkStart w:id="0" w:name="_GoBack"/>
+      <w:bookmarkEnd w:id="0"/>
     </w:p>
     <w:sectPr>
       <w:pgSz w:w="11906" w:h="16838"/>

</xml_diff>

<commit_message>
A littlebit Lecture 11 and full lecture 12
</commit_message>
<xml_diff>
--- a/Lecture7.docx
+++ b/Lecture7.docx
@@ -354,16 +354,18 @@
         <w:jc w:val="left"/>
         <w:rPr>
           <w:rFonts w:hint="default" w:ascii="Times New Roman" w:hAnsi="Times New Roman" w:eastAsia="SimSun" w:cs="Times New Roman"/>
-          <w:b w:val="0"/>
-          <w:bCs w:val="0"/>
-          <w:sz w:val="24"/>
-          <w:szCs w:val="24"/>
-          <w:lang w:val="en-US"/>
-        </w:rPr>
-      </w:pPr>
-      <w:r>
-        <w:rPr>
-          <w:rFonts w:hint="default" w:ascii="Times New Roman" w:hAnsi="Times New Roman" w:eastAsia="SimSun" w:cs="Times New Roman"/>
+          <w:b/>
+          <w:bCs/>
+          <w:sz w:val="24"/>
+          <w:szCs w:val="24"/>
+          <w:lang w:val="en-US"/>
+        </w:rPr>
+      </w:pPr>
+      <w:r>
+        <w:rPr>
+          <w:rFonts w:hint="default" w:ascii="Times New Roman" w:hAnsi="Times New Roman" w:eastAsia="SimSun" w:cs="Times New Roman"/>
+          <w:b/>
+          <w:bCs/>
           <w:sz w:val="24"/>
           <w:szCs w:val="24"/>
         </w:rPr>
@@ -717,7 +719,28 @@
           <w:sz w:val="24"/>
           <w:szCs w:val="24"/>
         </w:rPr>
-        <w:t>Ví dụ thực tế: Character-level Language Model + Embedding</w:t>
+        <w:t>Ví dụ thực tế</w:t>
+      </w:r>
+      <w:r>
+        <w:rPr>
+          <w:rFonts w:hint="default" w:ascii="Times New Roman" w:hAnsi="Times New Roman" w:eastAsia="SimSun" w:cs="Times New Roman"/>
+          <w:b/>
+          <w:bCs/>
+          <w:sz w:val="24"/>
+          <w:szCs w:val="24"/>
+          <w:lang w:val="en-US"/>
+        </w:rPr>
+        <w:t xml:space="preserve"> RNN</w:t>
+      </w:r>
+      <w:r>
+        <w:rPr>
+          <w:rFonts w:hint="default" w:ascii="Times New Roman" w:hAnsi="Times New Roman" w:eastAsia="SimSun" w:cs="Times New Roman"/>
+          <w:b/>
+          <w:bCs/>
+          <w:sz w:val="24"/>
+          <w:szCs w:val="24"/>
+        </w:rPr>
+        <w:t>: Character-level Language Model + Embedding</w:t>
       </w:r>
     </w:p>
     <w:p>
@@ -2086,7 +2109,7 @@
           <w:lang w:val="en-US"/>
         </w:rPr>
         <w:object>
-          <v:shape id="_x0000_i1028" o:spt="75" type="#_x0000_t75" style="height:70pt;width:227pt;" o:ole="t" filled="f" o:preferrelative="t" stroked="f" coordsize="21600,21600">
+          <v:shape id="_x0000_i1026" o:spt="75" alt="" type="#_x0000_t75" style="height:70pt;width:227pt;" o:ole="t" filled="f" o:preferrelative="t" stroked="f" coordsize="21600,21600">
             <v:path/>
             <v:fill on="f" focussize="0,0"/>
             <v:stroke on="f"/>
@@ -2095,7 +2118,7 @@
             <w10:wrap type="none"/>
             <w10:anchorlock/>
           </v:shape>
-          <o:OLEObject Type="Embed" ProgID="Equation.KSEE3" ShapeID="_x0000_i1028" DrawAspect="Content" ObjectID="_1468075726" r:id="rId15">
+          <o:OLEObject Type="Embed" ProgID="Equation.KSEE3" ShapeID="_x0000_i1026" DrawAspect="Content" ObjectID="_1468075726" r:id="rId15">
             <o:LockedField>false</o:LockedField>
           </o:OLEObject>
         </w:object>
@@ -2125,6 +2148,8 @@
         </w:rPr>
         <w:t>Mà với hàm tanh đạo hàm thì hầu như sẽ bé hơn 1 tức là nếu T càng lớn thì tích các số bé hơn 1 càng nhỏ -&gt; vanishing gradient</w:t>
       </w:r>
+      <w:bookmarkStart w:id="0" w:name="_GoBack"/>
+      <w:bookmarkEnd w:id="0"/>
     </w:p>
     <w:p>
       <w:pPr>
@@ -2191,7 +2216,7 @@
           <w:lang w:val="en-US"/>
         </w:rPr>
         <w:object>
-          <v:shape id="_x0000_i1029" o:spt="75" type="#_x0000_t75" style="height:70pt;width:101pt;" o:ole="t" filled="f" o:preferrelative="t" stroked="f" coordsize="21600,21600">
+          <v:shape id="_x0000_i1028" o:spt="75" alt="" type="#_x0000_t75" style="height:70pt;width:101pt;" o:ole="t" filled="f" o:preferrelative="t" stroked="f" coordsize="21600,21600">
             <v:path/>
             <v:fill on="f" focussize="0,0"/>
             <v:stroke on="f"/>
@@ -2200,7 +2225,7 @@
             <w10:wrap type="none"/>
             <w10:anchorlock/>
           </v:shape>
-          <o:OLEObject Type="Embed" ProgID="Equation.KSEE3" ShapeID="_x0000_i1029" DrawAspect="Content" ObjectID="_1468075727" r:id="rId17">
+          <o:OLEObject Type="Embed" ProgID="Equation.KSEE3" ShapeID="_x0000_i1028" DrawAspect="Content" ObjectID="_1468075727" r:id="rId17">
             <o:LockedField>false</o:LockedField>
           </o:OLEObject>
         </w:object>
@@ -2822,8 +2847,6 @@
           <w:lang w:val="en-US"/>
         </w:rPr>
       </w:pPr>
-      <w:bookmarkStart w:id="0" w:name="_GoBack"/>
-      <w:bookmarkEnd w:id="0"/>
     </w:p>
     <w:sectPr>
       <w:pgSz w:w="11906" w:h="16838"/>

</xml_diff>